<commit_message>
docs: expand typefaces section + correct CLAUDE.md body font claim
The design system reference and CLAUDE.md both said "Body font:
Inter, system-ui, -apple-system." Verified against the codebase: the
real body declaration is the Apple system stack (-apple-system,
BlinkMacSystemFont, 'SF Pro Display', 'SF Pro Text', 'Segoe UI',
sans-serif). Inter is loaded via Google Fonts but currently used
only in the testers session UI. Corrected both docs.

Design system reference now has a dedicated Typefaces section
(between Spacing tokens and Type scale) with four sub-sections:
- Body — system font stack (what + why native-on-each-OS)
- Mono — SF Mono fallback chain (where it's used)
- Inter — loaded but reserved for specific surfaces
- When to reach for what (decision rule)

CLAUDE.md typography bullets now accurately describe the system
stack body, the mono stack, and Inter's actual scope.

Co-Authored-By: Claude Opus 4.7 <noreply@anthropic.com>
</commit_message>
<xml_diff>
--- a/docs/feature-specs/design-system-reference.docx
+++ b/docs/feature-specs/design-system-reference.docx
@@ -2729,6 +2729,139 @@
           <w:color w:val="0077C8"/>
           <w:sz w:val="30"/>
         </w:rPr>
+        <w:t>Typefaces</w:t>
+      </w:r>
+    </w:p>
+    <w:p>
+      <w:pPr>
+        <w:spacing w:after="120"/>
+        <w:pBdr>
+          <w:bottom w:val="single" w:sz="8" w:space="1" w:color="0077C8"/>
+        </w:pBdr>
+      </w:pPr>
+    </w:p>
+    <w:p>
+      <w:pPr>
+        <w:spacing w:after="120"/>
+      </w:pPr>
+      <w:r>
+        <w:rPr>
+          <w:color w:val="1A1A1A"/>
+          <w:sz w:val="21"/>
+        </w:rPr>
+        <w:t>Three font families show up in the build: the system stack for body, an SF Mono fallback for code, and Inter for specific overlay surfaces. The body is the default; everything else is opt-in.</w:t>
+      </w:r>
+    </w:p>
+    <w:p>
+      <w:pPr>
+        <w:spacing w:before="200" w:after="80"/>
+      </w:pPr>
+      <w:r>
+        <w:rPr>
+          <w:b/>
+          <w:color w:val="1A1A1A"/>
+          <w:sz w:val="24"/>
+        </w:rPr>
+        <w:t>Body — system font stack</w:t>
+      </w:r>
+    </w:p>
+    <w:p>
+      <w:pPr>
+        <w:spacing w:after="120"/>
+      </w:pPr>
+      <w:r>
+        <w:rPr>
+          <w:color w:val="1A1A1A"/>
+          <w:sz w:val="21"/>
+        </w:rPr>
+        <w:t>Stack: -apple-system, BlinkMacSystemFont, 'SF Pro Display', 'SF Pro Text', 'Segoe UI', sans-serif. Set on the body selector; everything inherits unless it explicitly overrides. On macOS/iOS this resolves to SF Pro; on Windows to Segoe UI; on Android to Roboto via the system fallback. The deliberate choice: the app feels native on each OS, no flash of unstyled text on first load, no extra HTTP request before first paint. Most of the UI lives here.</w:t>
+      </w:r>
+    </w:p>
+    <w:p>
+      <w:pPr>
+        <w:spacing w:before="200" w:after="80"/>
+      </w:pPr>
+      <w:r>
+        <w:rPr>
+          <w:b/>
+          <w:color w:val="1A1A1A"/>
+          <w:sz w:val="24"/>
+        </w:rPr>
+        <w:t>Mono — SF Mono fallback chain</w:t>
+      </w:r>
+    </w:p>
+    <w:p>
+      <w:pPr>
+        <w:spacing w:after="120"/>
+      </w:pPr>
+      <w:r>
+        <w:rPr>
+          <w:color w:val="1A1A1A"/>
+          <w:sz w:val="21"/>
+        </w:rPr>
+        <w:t>Stack: 'SF Mono', Monaco, monospace (the dominant pattern; a few surfaces use the slightly longer ui-monospace, SFMono-Regular, Menlo variant). Used for: code blocks in the card description editor, ID badges (e.g. "#1142680" on service breadcrumbs), kbd shortcuts (the cmd-K hint in search), and inline code in markdown notes. Same native-on-each-OS fallback strategy.</w:t>
+      </w:r>
+    </w:p>
+    <w:p>
+      <w:pPr>
+        <w:spacing w:before="200" w:after="80"/>
+      </w:pPr>
+      <w:r>
+        <w:rPr>
+          <w:b/>
+          <w:color w:val="1A1A1A"/>
+          <w:sz w:val="24"/>
+        </w:rPr>
+        <w:t>Inter — loaded but reserved for specific surfaces</w:t>
+      </w:r>
+    </w:p>
+    <w:p>
+      <w:pPr>
+        <w:spacing w:after="120"/>
+      </w:pPr>
+      <w:r>
+        <w:rPr>
+          <w:color w:val="1A1A1A"/>
+          <w:sz w:val="21"/>
+        </w:rPr>
+        <w:t>Inter is loaded via Google Fonts in index.html at weights 400, 500, 600, 700. Currently used only in the testers session UI (the sign-in gate and identity widget that overlays the app before auth resolves). Available everywhere if you need it; the dev can opt-in for a specific surface by setting font-family: 'Inter', -apple-system, ... explicitly. Don't swap it onto body without a reason; the system stack is the default for a reason.</w:t>
+      </w:r>
+    </w:p>
+    <w:p>
+      <w:pPr>
+        <w:spacing w:before="200" w:after="80"/>
+      </w:pPr>
+      <w:r>
+        <w:rPr>
+          <w:b/>
+          <w:color w:val="1A1A1A"/>
+          <w:sz w:val="24"/>
+        </w:rPr>
+        <w:t>When to reach for what</w:t>
+      </w:r>
+    </w:p>
+    <w:p>
+      <w:pPr>
+        <w:spacing w:after="120"/>
+      </w:pPr>
+      <w:r>
+        <w:rPr>
+          <w:color w:val="1A1A1A"/>
+          <w:sz w:val="21"/>
+        </w:rPr>
+        <w:t>Default: do nothing. The body inherits the system stack and you get OS-native typography for free. Code / IDs / shortcuts: use mono with the fallback chain above. Brand surfaces or specific moments where you want a consistent look across all OSes (e.g. an in-product onboarding screen): opt into Inter explicitly. The rule of thumb: one typeface for everything UI, two at most if there's a deliberate reason.</w:t>
+      </w:r>
+    </w:p>
+    <w:p>
+      <w:pPr>
+        <w:spacing w:before="280" w:after="80"/>
+      </w:pPr>
+      <w:r>
+        <w:rPr>
+          <w:b/>
+          <w:color w:val="0077C8"/>
+          <w:sz w:val="30"/>
+        </w:rPr>
         <w:t>Type scale</w:t>
       </w:r>
     </w:p>
@@ -2749,7 +2882,7 @@
           <w:color w:val="1A1A1A"/>
           <w:sz w:val="21"/>
         </w:rPr>
-        <w:t>Body font: Inter, system-ui, -apple-system. Mono: SF Mono, Monaco. One typeface for everything UI; two at most if a brand wordmark uses something specific. Variable weights give all the range the hierarchy needs. Weight + size carry hierarchy before color or borders.</w:t>
+        <w:t>Weight + size carry hierarchy before color or borders. The full type scale is below; the typeface section above explains which font the body, mono, and accent surfaces resolve to.</w:t>
       </w:r>
     </w:p>
     <w:p>

</xml_diff>